<commit_message>
docs: regenerate e2e screenshots, test report and manual for the feedback round
125 screenshots from the full walkthrough (project lifecycle with the
application tab, shared tool pool and tool job page, spreadsheet-style
preprocessing drawer, Markdown discussions, single superadmin, user picker,
usage page) plus the Keycloak-mode login / logout run; report PDF and manual
DOCX / PDF rebuilt from them.

Co-Authored-By: Claude Fable 5.1 <noreply@anthropic.com>
Claude-Session: https://claude.ai/code/session_01SiXmRspMhVVeS1X5oygJps
</commit_message>
<xml_diff>
--- a/docs/manuals/QR-AI-Lab-使用手冊.docx
+++ b/docs/manuals/QR-AI-Lab-使用手冊.docx
@@ -709,7 +709,7 @@
                 <w:sz w:val="19"/>
                 <w:szCs w:val="19"/>
               </w:rPr>
-              <w:t xml:space="preserve">日常營運：審核申請、重排佇列、強制中斷 / 重新執行 / 刪除任何任務、關閉或刪除討論串；資源池、配額、模型庫只能看</w:t>
+              <w:t xml:space="preserve">日常營運：在專案的「申請」分頁審核、重排佇列、強制中斷 / 重新執行 / 刪除任何任務、關閉或刪除討論串；資源池、配額、模型庫只能看</w:t>
             </w:r>
           </w:p>
         </w:tc>
@@ -737,7 +737,7 @@
                 <w:sz w:val="19"/>
                 <w:szCs w:val="19"/>
               </w:rPr>
-              <w:t xml:space="preserve">系統管理員（superadmin）</w:t>
+              <w:t xml:space="preserve">系統管理員（superadmin，固定一位，由 SUPERADMIN_USERNAME 指定）</w:t>
             </w:r>
           </w:p>
         </w:tc>
@@ -763,7 +763,7 @@
                 <w:sz w:val="19"/>
                 <w:szCs w:val="19"/>
               </w:rPr>
-              <w:t xml:space="preserve">admin 的一切，加上：設定總資源池、調專案配額、刪除專案、上傳 / 匯入模型庫權重、調整每個人的系統角色、強制釋放 GPU 顯存</w:t>
+              <w:t xml:space="preserve">admin 的一切，加上：設定總資源池與工具池、在專案「設定」分頁調配額、刪除專案、上傳 / 匯入模型庫權重、把使用者設成 admin / user、強制釋放 GPU 顯存</w:t>
             </w:r>
           </w:p>
         </w:tc>
@@ -779,7 +779,7 @@
           <w:sz w:val="21"/>
           <w:szCs w:val="21"/>
         </w:rPr>
-        <w:t xml:space="preserve">登入方式由系統管理員設定：開發 / 過渡期用平台自己的帳號密碼；正式環境按「使用公司帳號登入（Keycloak）」走公司單一登入，第一次登入會自動建立帳號，角色由 Keycloak 的群組對應或由系統管理員在「使用者」頁指定。</w:t>
+        <w:t xml:space="preserve">登入方式由系統管理員設定：開發 / 過渡期用平台自己的帳號密碼；正式環境按「使用公司帳號登入（Keycloak）」走公司單一登入，第一次登入會自動建立帳號（Keycloak 只提供身分），角色由系統管理員在「使用者」頁指定。</w:t>
       </w:r>
     </w:p>
     <w:p>
@@ -1014,7 +1014,7 @@
       <w:r>
         <w:drawing>
           <wp:inline distT="0" distB="0" distL="0" distR="0">
-            <wp:extent cx="4191000" cy="4219575"/>
+            <wp:extent cx="4191000" cy="3076575"/>
             <wp:effectExtent t="0" r="0" b="0" l="0"/>
             <wp:docPr id="1" name="" descr="" title=""/>
             <wp:cNvGraphicFramePr>
@@ -1039,7 +1039,7 @@
                   <pic:spPr bwMode="auto">
                     <a:xfrm>
                       <a:off x="0" y="0"/>
-                      <a:ext cx="4191000" cy="4219575"/>
+                      <a:ext cx="4191000" cy="3076575"/>
                     </a:xfrm>
                     <a:prstGeom prst="rect">
                       <a:avLst/>
@@ -1077,7 +1077,7 @@
       <w:r>
         <w:drawing>
           <wp:inline distT="0" distB="0" distL="0" distR="0">
-            <wp:extent cx="4191000" cy="5172075"/>
+            <wp:extent cx="4191000" cy="2828925"/>
             <wp:effectExtent t="0" r="0" b="0" l="0"/>
             <wp:docPr id="1" name="" descr="" title=""/>
             <wp:cNvGraphicFramePr>
@@ -1102,7 +1102,7 @@
                   <pic:spPr bwMode="auto">
                     <a:xfrm>
                       <a:off x="0" y="0"/>
-                      <a:ext cx="4191000" cy="5172075"/>
+                      <a:ext cx="4191000" cy="2828925"/>
                     </a:xfrm>
                     <a:prstGeom prst="rect">
                       <a:avLst/>
@@ -3407,7 +3407,7 @@
           <w:sz w:val="21"/>
           <w:szCs w:val="21"/>
         </w:rPr>
-        <w:t xml:space="preserve">左側選單「資料前處理」：不需要專案也能用。選資料類型 → 上傳檔案 → 加入步驟並抽樣預覽（即時，只取樣）→ 「建立前處理任務」。整個檔案的處理是你個人工作區裡的任務：和其他任務一樣排隊、受配額限制、有即時 log；完成後到任務頁下載 zip（processed.csv / .npy / images/、pipeline.json、summary.json）。上傳檔在任務結束時刪除，結果 zip 下載一次就刪、沒下載的在管理員設定的時間（預設 24 小時）後刪。</w:t>
+        <w:t xml:space="preserve">左側選單「資料前處理」：不需要專案也能用。選資料類型 → 上傳檔案 → 加入步驟並抽樣預覽（即時，只取樣）→ 「建立前處理任務」。整個檔案的處理是公共工具池裡的任務（不佔用任何專案的配額，每人同時有數量上限）：和其他任務一樣排隊、有即時 log；完成後到「工具」裡的任務頁下載 zip（processed.csv / .npy / images/、pipeline.json、summary.json）。上傳檔在任務結束時刪除，結果 zip 下載一次就刪、沒下載的在管理員設定的時間（預設 24 小時）後刪。</w:t>
       </w:r>
     </w:p>
     <w:p>
@@ -3418,7 +3418,7 @@
       <w:r>
         <w:drawing>
           <wp:inline distT="0" distB="0" distL="0" distR="0">
-            <wp:extent cx="4191000" cy="5400675"/>
+            <wp:extent cx="4191000" cy="4295775"/>
             <wp:effectExtent t="0" r="0" b="0" l="0"/>
             <wp:docPr id="1" name="" descr="" title=""/>
             <wp:cNvGraphicFramePr>
@@ -3443,7 +3443,7 @@
                   <pic:spPr bwMode="auto">
                     <a:xfrm>
                       <a:off x="0" y="0"/>
-                      <a:ext cx="4191000" cy="5400675"/>
+                      <a:ext cx="4191000" cy="4295775"/>
                     </a:xfrm>
                     <a:prstGeom prst="rect">
                       <a:avLst/>
@@ -3574,7 +3574,7 @@
       <w:r>
         <w:drawing>
           <wp:inline distT="0" distB="0" distL="0" distR="0">
-            <wp:extent cx="4191000" cy="7419975"/>
+            <wp:extent cx="4191000" cy="6810375"/>
             <wp:effectExtent t="0" r="0" b="0" l="0"/>
             <wp:docPr id="1" name="" descr="" title=""/>
             <wp:cNvGraphicFramePr>
@@ -3599,7 +3599,7 @@
                   <pic:spPr bwMode="auto">
                     <a:xfrm>
                       <a:off x="0" y="0"/>
-                      <a:ext cx="4191000" cy="7419975"/>
+                      <a:ext cx="4191000" cy="6810375"/>
                     </a:xfrm>
                     <a:prstGeom prst="rect">
                       <a:avLst/>
@@ -3637,7 +3637,7 @@
       <w:r>
         <w:drawing>
           <wp:inline distT="0" distB="0" distL="0" distR="0">
-            <wp:extent cx="4191000" cy="7058025"/>
+            <wp:extent cx="4191000" cy="6448425"/>
             <wp:effectExtent t="0" r="0" b="0" l="0"/>
             <wp:docPr id="1" name="" descr="" title=""/>
             <wp:cNvGraphicFramePr>
@@ -3662,7 +3662,7 @@
                   <pic:spPr bwMode="auto">
                     <a:xfrm>
                       <a:off x="0" y="0"/>
-                      <a:ext cx="4191000" cy="7058025"/>
+                      <a:ext cx="4191000" cy="6448425"/>
                     </a:xfrm>
                     <a:prstGeom prst="rect">
                       <a:avLst/>
@@ -6288,7 +6288,7 @@
           <w:sz w:val="21"/>
           <w:szCs w:val="21"/>
         </w:rPr>
-        <w:t xml:space="preserve">角色（superadmin）：「使用者」頁直接把人設成 superadmin / admin / user 或停用；不能降級自己，也不能移除最後一位 superadmin。Keycloak 的群組對應到的角色會在登入時覆蓋。</w:t>
+        <w:t xml:space="preserve">角色（superadmin）：「使用者」頁把人設成 admin / user 或停用；superadmin 只有一位，由伺服器設定 SUPERADMIN_USERNAME 指定，介面上不能指派。Keycloak 只提供身分，不決定角色。</w:t>
       </w:r>
     </w:p>
     <w:p>
@@ -6414,7 +6414,7 @@
           <w:sz w:val="21"/>
           <w:szCs w:val="21"/>
         </w:rPr>
-        <w:t xml:space="preserve">專案申請審核（admin 以上）：核准時指定 slug、GPU / CPU / 記憶體 / 儲存配額、同時執行上限與成員。</w:t>
+        <w:t xml:space="preserve">專案申請審核（admin 以上）：專案列表以「申請中 / 審核中」篩選就是待審清單；在專案的「申請」分頁開始審核、核准（設定 GPU / CPU / 記憶體 / 儲存配額、同時執行上限與成員）或退回。工具池（superadmin）：所有人前處理 / 分析任務共用的配額與每人同時上限。</w:t>
       </w:r>
     </w:p>
     <w:p>
@@ -6695,7 +6695,7 @@
       <w:r>
         <w:drawing>
           <wp:inline distT="0" distB="0" distL="0" distR="0">
-            <wp:extent cx="4191000" cy="3562350"/>
+            <wp:extent cx="4191000" cy="3886200"/>
             <wp:effectExtent t="0" r="0" b="0" l="0"/>
             <wp:docPr id="1" name="" descr="" title=""/>
             <wp:cNvGraphicFramePr>
@@ -6720,7 +6720,7 @@
                   <pic:spPr bwMode="auto">
                     <a:xfrm>
                       <a:off x="0" y="0"/>
-                      <a:ext cx="4191000" cy="3562350"/>
+                      <a:ext cx="4191000" cy="3886200"/>
                     </a:xfrm>
                     <a:prstGeom prst="rect">
                       <a:avLst/>
@@ -7367,7 +7367,7 @@
           <w:sz w:val="17"/>
           <w:szCs w:val="17"/>
         </w:rPr>
-        <w:t xml:space="preserve">POST /project-requests                                  專案申請；/{id}/approve 管理員核准</w:t>
+        <w:t xml:space="preserve">POST /projects                                          專案申請（建立 pending 專案）；/{slug}/approve 管理員核准</w:t>
       </w:r>
     </w:p>
     <w:p>

</xml_diff>

<commit_message>
docs: rebuild the user manual (DINOv2 fine-tune augmentation options)
Co-Authored-By: Claude Fable 5.1 <noreply@anthropic.com>
Claude-Session: https://claude.ai/code/session_01SiXmRspMhVVeS1X5oygJps
</commit_message>
<xml_diff>
--- a/docs/manuals/QR-AI-Lab-使用手冊.docx
+++ b/docs/manuals/QR-AI-Lab-使用手冊.docx
@@ -1140,7 +1140,7 @@
       <w:r>
         <w:drawing>
           <wp:inline distT="0" distB="0" distL="0" distR="0">
-            <wp:extent cx="4191000" cy="3524250"/>
+            <wp:extent cx="4191000" cy="2619375"/>
             <wp:effectExtent t="0" r="0" b="0" l="0"/>
             <wp:docPr id="1" name="" descr="" title=""/>
             <wp:cNvGraphicFramePr>
@@ -1165,7 +1165,7 @@
                   <pic:spPr bwMode="auto">
                     <a:xfrm>
                       <a:off x="0" y="0"/>
-                      <a:ext cx="4191000" cy="3524250"/>
+                      <a:ext cx="4191000" cy="2619375"/>
                     </a:xfrm>
                     <a:prstGeom prst="rect">
                       <a:avLst/>
@@ -5048,7 +5048,7 @@
           <w:sz w:val="21"/>
           <w:szCs w:val="21"/>
         </w:rPr>
-        <w:t xml:space="preserve">其他參數：epochs、lr、rank（LoRA 秩）、batch；自動模式會在 linear / lora 之間搜尋。推論 predict 回 prediction、confidence、top3（config.min_confidence 可讓低信心的回 unknown）；retrieve 找最像的訓練影像；embed 輸出特徵向量。</w:t>
+        <w:t xml:space="preserve">其他參數：epochs、lr、rank（LoRA 秩）、batch、augment（訓練時的隨機增強，自己挑：hflip、vflip、rotate90、crop、brightness、contrast；方向有意義的影像不要加翻轉 / 旋轉）；自動模式會在 linear / lora 之間搜尋。推論 predict 回 prediction、confidence、top3（config.min_confidence 可讓低信心的回 unknown）；retrieve 找最像的訓練影像；embed 輸出特徵向量。</w:t>
       </w:r>
     </w:p>
     <w:p>
@@ -6514,7 +6514,7 @@
       <w:r>
         <w:drawing>
           <wp:inline distT="0" distB="0" distL="0" distR="0">
-            <wp:extent cx="4191000" cy="3981450"/>
+            <wp:extent cx="4191000" cy="4067175"/>
             <wp:effectExtent t="0" r="0" b="0" l="0"/>
             <wp:docPr id="1" name="" descr="" title=""/>
             <wp:cNvGraphicFramePr>
@@ -6539,7 +6539,7 @@
                   <pic:spPr bwMode="auto">
                     <a:xfrm>
                       <a:off x="0" y="0"/>
-                      <a:ext cx="4191000" cy="3981450"/>
+                      <a:ext cx="4191000" cy="4067175"/>
                     </a:xfrm>
                     <a:prstGeom prst="rect">
                       <a:avLst/>

</xml_diff>